<commit_message>
Enhance document export tests and functionality
- Added tests to ensure correct ordering of sections in exported Word documents, specifically placing "Process Information" before "Datasets".
- Verified that only specific tables are rendered in landscape orientation and that the rest of the document remains in portrait.
- Ensured that validation rules are correctly displayed in landscape when present.
- Improved handling of signature blocks, ensuring no filler lines or meta explanations are included when not authorized.
- Updated tests for template variable extraction to include checks for multiline values and proper formatting.
- Enhanced group condition rule descriptions to provide clearer, more detailed outputs in exported documents.
- Adjusted the export modal defaults in the Shiny app to ensure Word format is selected with YAML embedded by default.
- Improved the `dta_export_stem` function to correctly format filenames based on metadata, including versioning and date handling.
</commit_message>
<xml_diff>
--- a/inst/extdata/templates/dta_numbered_template.docx
+++ b/inst/extdata/templates/dta_numbered_template.docx
@@ -714,13 +714,14 @@
         <w:numId w:val="3"/>
       </w:numPr>
       <w:pBdr>
-        <w:bottom w:val="single" w:sz="4" w:space="1" w:color="auto"/>
+        <w:bottom w:val="single" w:sz="4" w:space="1" w:color="00625B"/>
       </w:pBdr>
       <w:spacing w:before="480"/>
       <w:outlineLvl w:val="0"/>
     </w:pPr>
     <w:rPr>
       <w:rFonts w:asciiTheme="majorHAnsi" w:eastAsiaTheme="majorEastAsia" w:hAnsiTheme="majorHAnsi" w:cstheme="majorBidi"/>
+      <w:color w:val="00625B"/>
       <w:b/>
       <w:bCs/>
       <w:sz w:val="32"/>
@@ -749,6 +750,7 @@
     </w:pPr>
     <w:rPr>
       <w:rFonts w:asciiTheme="majorHAnsi" w:eastAsiaTheme="majorEastAsia" w:hAnsiTheme="majorHAnsi" w:cstheme="majorBidi"/>
+      <w:color w:val="00625B"/>
       <w:b/>
       <w:bCs/>
       <w:sz w:val="26"/>
@@ -777,6 +779,7 @@
     </w:pPr>
     <w:rPr>
       <w:rFonts w:asciiTheme="majorHAnsi" w:eastAsiaTheme="majorEastAsia" w:hAnsiTheme="majorHAnsi" w:cstheme="majorBidi"/>
+      <w:color w:val="00625B"/>
       <w:b/>
       <w:bCs/>
     </w:rPr>
@@ -1131,6 +1134,7 @@
     </w:pPr>
     <w:rPr>
       <w:rFonts w:asciiTheme="majorHAnsi" w:eastAsiaTheme="majorEastAsia" w:hAnsiTheme="majorHAnsi" w:cstheme="majorBidi"/>
+      <w:color w:val="00625B"/>
       <w:b/>
       <w:bCs/>
       <w:iCs/>

</xml_diff>